<commit_message>
Added transactions & sessions in teachers controllers
</commit_message>
<xml_diff>
--- a/phase-saas.docx
+++ b/phase-saas.docx
@@ -765,6 +765,14 @@
         </w:rPr>
         <w:t>Create Class model with:</w:t>
       </w:r>
+      <w:r>
+        <w:rPr>
+          <w:rFonts w:ascii="Times New Roman" w:eastAsia="Times New Roman" w:hAnsi="Times New Roman" w:cs="Times New Roman"/>
+          <w:sz w:val="24"/>
+          <w:szCs w:val="24"/>
+        </w:rPr>
+        <w:t xml:space="preserve">  done</w:t>
+      </w:r>
     </w:p>
     <w:p>
       <w:pPr>
@@ -879,6 +887,22 @@
         </w:rPr>
         <w:t>Design "Create Class" form.</w:t>
       </w:r>
+      <w:r>
+        <w:rPr>
+          <w:rFonts w:ascii="Times New Roman" w:eastAsia="Times New Roman" w:hAnsi="Times New Roman" w:cs="Times New Roman"/>
+          <w:sz w:val="24"/>
+          <w:szCs w:val="24"/>
+        </w:rPr>
+        <w:t xml:space="preserve"> </w:t>
+      </w:r>
+      <w:r>
+        <w:rPr>
+          <w:rFonts w:ascii="Times New Roman" w:eastAsia="Times New Roman" w:hAnsi="Times New Roman" w:cs="Times New Roman"/>
+          <w:sz w:val="24"/>
+          <w:szCs w:val="24"/>
+        </w:rPr>
+        <w:t>done</w:t>
+      </w:r>
     </w:p>
     <w:p>
       <w:pPr>
@@ -901,6 +925,22 @@
         </w:rPr>
         <w:t>Create API to create a class.</w:t>
       </w:r>
+      <w:r>
+        <w:rPr>
+          <w:rFonts w:ascii="Times New Roman" w:eastAsia="Times New Roman" w:hAnsi="Times New Roman" w:cs="Times New Roman"/>
+          <w:sz w:val="24"/>
+          <w:szCs w:val="24"/>
+        </w:rPr>
+        <w:t xml:space="preserve"> </w:t>
+      </w:r>
+      <w:r>
+        <w:rPr>
+          <w:rFonts w:ascii="Times New Roman" w:eastAsia="Times New Roman" w:hAnsi="Times New Roman" w:cs="Times New Roman"/>
+          <w:sz w:val="24"/>
+          <w:szCs w:val="24"/>
+        </w:rPr>
+        <w:t>done</w:t>
+      </w:r>
     </w:p>
     <w:p>
       <w:pPr>
@@ -923,6 +963,22 @@
         </w:rPr>
         <w:t>Create API to fetch all classes.</w:t>
       </w:r>
+      <w:r>
+        <w:rPr>
+          <w:rFonts w:ascii="Times New Roman" w:eastAsia="Times New Roman" w:hAnsi="Times New Roman" w:cs="Times New Roman"/>
+          <w:sz w:val="24"/>
+          <w:szCs w:val="24"/>
+        </w:rPr>
+        <w:t xml:space="preserve"> </w:t>
+      </w:r>
+      <w:r>
+        <w:rPr>
+          <w:rFonts w:ascii="Times New Roman" w:eastAsia="Times New Roman" w:hAnsi="Times New Roman" w:cs="Times New Roman"/>
+          <w:sz w:val="24"/>
+          <w:szCs w:val="24"/>
+        </w:rPr>
+        <w:t>done</w:t>
+      </w:r>
     </w:p>
     <w:p>
       <w:pPr>
@@ -945,6 +1001,22 @@
         </w:rPr>
         <w:t>Edit class.</w:t>
       </w:r>
+      <w:r>
+        <w:rPr>
+          <w:rFonts w:ascii="Times New Roman" w:eastAsia="Times New Roman" w:hAnsi="Times New Roman" w:cs="Times New Roman"/>
+          <w:sz w:val="24"/>
+          <w:szCs w:val="24"/>
+        </w:rPr>
+        <w:t xml:space="preserve"> </w:t>
+      </w:r>
+      <w:r>
+        <w:rPr>
+          <w:rFonts w:ascii="Times New Roman" w:eastAsia="Times New Roman" w:hAnsi="Times New Roman" w:cs="Times New Roman"/>
+          <w:sz w:val="24"/>
+          <w:szCs w:val="24"/>
+        </w:rPr>
+        <w:t>done</w:t>
+      </w:r>
     </w:p>
     <w:p>
       <w:pPr>
@@ -967,6 +1039,73 @@
         </w:rPr>
         <w:t>Delete class.</w:t>
       </w:r>
+      <w:r>
+        <w:rPr>
+          <w:rFonts w:ascii="Times New Roman" w:eastAsia="Times New Roman" w:hAnsi="Times New Roman" w:cs="Times New Roman"/>
+          <w:sz w:val="24"/>
+          <w:szCs w:val="24"/>
+        </w:rPr>
+        <w:t xml:space="preserve"> D</w:t>
+      </w:r>
+      <w:r>
+        <w:rPr>
+          <w:rFonts w:ascii="Times New Roman" w:eastAsia="Times New Roman" w:hAnsi="Times New Roman" w:cs="Times New Roman"/>
+          <w:sz w:val="24"/>
+          <w:szCs w:val="24"/>
+        </w:rPr>
+        <w:t>one</w:t>
+      </w:r>
+    </w:p>
+    <w:p>
+      <w:pPr>
+        <w:pStyle w:val="Heading4"/>
+        <w:rPr>
+          <w:rFonts w:eastAsia="Times New Roman"/>
+        </w:rPr>
+      </w:pPr>
+      <w:r>
+        <w:rPr>
+          <w:rFonts w:eastAsia="Times New Roman"/>
+        </w:rPr>
+        <w:lastRenderedPageBreak/>
+        <w:t xml:space="preserve">Add </w:t>
+      </w:r>
+      <w:proofErr w:type="spellStart"/>
+      <w:r>
+        <w:rPr>
+          <w:rFonts w:eastAsia="Times New Roman"/>
+        </w:rPr>
+        <w:t>subjet</w:t>
+      </w:r>
+      <w:proofErr w:type="spellEnd"/>
+      <w:r>
+        <w:rPr>
+          <w:rFonts w:eastAsia="Times New Roman"/>
+        </w:rPr>
+        <w:t xml:space="preserve"> in class - done</w:t>
+      </w:r>
+    </w:p>
+    <w:p>
+      <w:pPr>
+        <w:numPr>
+          <w:ilvl w:val="0"/>
+          <w:numId w:val="4"/>
+        </w:numPr>
+        <w:spacing w:before="100" w:beforeAutospacing="1" w:after="100" w:afterAutospacing="1" w:line="240" w:lineRule="auto"/>
+        <w:rPr>
+          <w:rFonts w:ascii="Times New Roman" w:eastAsia="Times New Roman" w:hAnsi="Times New Roman" w:cs="Times New Roman"/>
+          <w:sz w:val="24"/>
+          <w:szCs w:val="24"/>
+        </w:rPr>
+      </w:pPr>
+      <w:r>
+        <w:rPr>
+          <w:rFonts w:ascii="Times New Roman" w:eastAsia="Times New Roman" w:hAnsi="Times New Roman" w:cs="Times New Roman"/>
+          <w:sz w:val="24"/>
+          <w:szCs w:val="24"/>
+        </w:rPr>
+        <w:t>Remove subject from close - done</w:t>
+      </w:r>
     </w:p>
     <w:p>
       <w:pPr>
@@ -983,7 +1122,6 @@
           <w:sz w:val="24"/>
           <w:szCs w:val="24"/>
         </w:rPr>
-        <w:lastRenderedPageBreak/>
         <w:pict w14:anchorId="643E1B44">
           <v:rect id="_x0000_i1028" style="width:0;height:1.5pt" o:hralign="center" o:hrstd="t" o:hr="t" fillcolor="#a0a0a0" stroked="f"/>
         </w:pict>
@@ -1599,6 +1737,7 @@
           <w:sz w:val="24"/>
           <w:szCs w:val="24"/>
         </w:rPr>
+        <w:lastRenderedPageBreak/>
         <w:t>Only School Admin can:</w:t>
       </w:r>
     </w:p>
@@ -1687,7 +1826,6 @@
           <w:sz w:val="24"/>
           <w:szCs w:val="24"/>
         </w:rPr>
-        <w:lastRenderedPageBreak/>
         <w:t>Assign Teachers.</w:t>
       </w:r>
     </w:p>
@@ -2558,17 +2696,9 @@
         <w:rPr>
           <w:rStyle w:val="HTMLCode"/>
         </w:rPr>
-        <w:t>req.</w:t>
-      </w:r>
-      <w:proofErr w:type="gramStart"/>
-      <w:r>
-        <w:rPr>
-          <w:rStyle w:val="HTMLCode"/>
-        </w:rPr>
-        <w:t>user.schoolId</w:t>
+        <w:t>req.user.schoolId</w:t>
       </w:r>
       <w:proofErr w:type="spellEnd"/>
-      <w:proofErr w:type="gramEnd"/>
     </w:p>
     <w:p>
       <w:pPr>
@@ -2702,21 +2832,7 @@
         <w:rPr>
           <w:rStyle w:val="HTMLCode"/>
         </w:rPr>
-        <w:t xml:space="preserve">Ahmed        </w:t>
-      </w:r>
-      <w:proofErr w:type="gramStart"/>
-      <w:r>
-        <w:rPr>
-          <w:rStyle w:val="HTMLCode"/>
-        </w:rPr>
-        <w:t>ahmed@gmail.com  0300</w:t>
-      </w:r>
-      <w:proofErr w:type="gramEnd"/>
-      <w:r>
-        <w:rPr>
-          <w:rStyle w:val="HTMLCode"/>
-        </w:rPr>
-        <w:t>xxxxxx   Edit Delete</w:t>
+        <w:t>Ahmed        ahmed@gmail.com  0300xxxxxx   Edit Delete</w:t>
       </w:r>
     </w:p>
     <w:p>
@@ -3483,13 +3599,8 @@
       <w:pPr>
         <w:pStyle w:val="NormalWeb"/>
       </w:pPr>
-      <w:proofErr w:type="gramStart"/>
-      <w:r>
-        <w:t>This updates</w:t>
-      </w:r>
-      <w:proofErr w:type="gramEnd"/>
-      <w:r>
-        <w:t>:</w:t>
+      <w:r>
+        <w:t>This updates:</w:t>
       </w:r>
     </w:p>
     <w:p>
@@ -6940,6 +7051,28 @@
       <w:szCs w:val="27"/>
     </w:rPr>
   </w:style>
+  <w:style w:type="paragraph" w:styleId="Heading4">
+    <w:name w:val="heading 4"/>
+    <w:basedOn w:val="Normal"/>
+    <w:next w:val="Normal"/>
+    <w:link w:val="Heading4Char"/>
+    <w:uiPriority w:val="9"/>
+    <w:unhideWhenUsed/>
+    <w:qFormat/>
+    <w:rsid w:val="00D553B8"/>
+    <w:pPr>
+      <w:keepNext/>
+      <w:keepLines/>
+      <w:spacing w:before="40" w:after="0"/>
+      <w:outlineLvl w:val="3"/>
+    </w:pPr>
+    <w:rPr>
+      <w:rFonts w:asciiTheme="majorHAnsi" w:eastAsiaTheme="majorEastAsia" w:hAnsiTheme="majorHAnsi" w:cstheme="majorBidi"/>
+      <w:i/>
+      <w:iCs/>
+      <w:color w:val="2F5496" w:themeColor="accent1" w:themeShade="BF"/>
+    </w:rPr>
+  </w:style>
   <w:style w:type="character" w:default="1" w:styleId="DefaultParagraphFont">
     <w:name w:val="Default Paragraph Font"/>
     <w:uiPriority w:val="1"/>
@@ -7094,6 +7227,19 @@
       <w:rFonts w:ascii="Courier New" w:eastAsia="Times New Roman" w:hAnsi="Courier New" w:cs="Courier New"/>
       <w:sz w:val="20"/>
       <w:szCs w:val="20"/>
+    </w:rPr>
+  </w:style>
+  <w:style w:type="character" w:customStyle="1" w:styleId="Heading4Char">
+    <w:name w:val="Heading 4 Char"/>
+    <w:basedOn w:val="DefaultParagraphFont"/>
+    <w:link w:val="Heading4"/>
+    <w:uiPriority w:val="9"/>
+    <w:rsid w:val="00D553B8"/>
+    <w:rPr>
+      <w:rFonts w:asciiTheme="majorHAnsi" w:eastAsiaTheme="majorEastAsia" w:hAnsiTheme="majorHAnsi" w:cstheme="majorBidi"/>
+      <w:i/>
+      <w:iCs/>
+      <w:color w:val="2F5496" w:themeColor="accent1" w:themeShade="BF"/>
     </w:rPr>
   </w:style>
 </w:styles>

</xml_diff>